<commit_message>
Replace Print Layout tab with shared Contour publication composer and Print Preview overlay.
Preview and Side-by-Side DOCX now share Contour-faithful spacing minima, English overflow expansion, and multi-page pagination.

Co-authored-by: Cursor <cursoragent@cursor.com>
</commit_message>
<xml_diff>
--- a/docs/assets/aleph-side-by-side/Job-19-21-29-side-by-side.docx
+++ b/docs/assets/aleph-side-by-side/Job-19-21-29-side-by-side.docx
@@ -67,7 +67,7 @@
           <w:p>
             <w:pPr>
               <w:jc w:val="left"/>
-              <w:spacing w:before="0" w:after="160" w:line="240" w:lineRule="auto"/>
+              <w:spacing w:before="0" w:after="0" w:line="240" w:lineRule="auto"/>
             </w:pPr>
             <w:r>
               <w:rPr>
@@ -75,7 +75,55 @@
                 <w:sz w:val="23"/>
                 <w:szCs w:val="23"/>
               </w:rPr>
-              <w:t xml:space="preserve">Be gracious to me, be gracious to me, you my friends, as the hand of God has struck me.</w:t>
+              <w:t xml:space="preserve">Be gracious to me,</w:t>
+            </w:r>
+            <w:r>
+              <w:rPr>
+                <w:rFonts w:ascii="Times New Roman" w:hAnsi="Times New Roman" w:cs="Times New Roman"/>
+                <w:sz w:val="23"/>
+                <w:szCs w:val="23"/>
+              </w:rPr>
+              <w:br/>
+            </w:r>
+            <w:r>
+              <w:rPr>
+                <w:rFonts w:ascii="Times New Roman" w:hAnsi="Times New Roman" w:cs="Times New Roman"/>
+                <w:sz w:val="23"/>
+                <w:szCs w:val="23"/>
+              </w:rPr>
+              <w:t xml:space="preserve">be gracious to me,</w:t>
+            </w:r>
+            <w:r>
+              <w:rPr>
+                <w:rFonts w:ascii="Times New Roman" w:hAnsi="Times New Roman" w:cs="Times New Roman"/>
+                <w:sz w:val="23"/>
+                <w:szCs w:val="23"/>
+              </w:rPr>
+              <w:br/>
+            </w:r>
+            <w:r>
+              <w:rPr>
+                <w:rFonts w:ascii="Times New Roman" w:hAnsi="Times New Roman" w:cs="Times New Roman"/>
+                <w:sz w:val="23"/>
+                <w:szCs w:val="23"/>
+              </w:rPr>
+              <w:t xml:space="preserve">you my friends,</w:t>
+            </w:r>
+            <w:r>
+              <w:rPr>
+                <w:rFonts w:ascii="Times New Roman" w:hAnsi="Times New Roman" w:cs="Times New Roman"/>
+                <w:sz w:val="23"/>
+                <w:szCs w:val="23"/>
+              </w:rPr>
+              <w:br/>
+            </w:r>
+            <w:r>
+              <w:rPr>
+                <w:rFonts w:ascii="Times New Roman" w:hAnsi="Times New Roman" w:cs="Times New Roman"/>
+                <w:sz w:val="23"/>
+                <w:szCs w:val="23"/>
+              </w:rPr>
+              <w:t xml:space="preserve">as the hand of God has struck me.</w:t>
             </w:r>
           </w:p>
         </w:tc>
@@ -175,8 +223,8 @@
             <w:pPr>
               <w:bidi/>
               <w:jc w:val="right"/>
-              <w:ind w:right="360"/>
-              <w:spacing w:after="120"/>
+              <w:ind w:right="450"/>
+              <w:spacing w:after="1498"/>
             </w:pPr>
             <w:r>
               <w:rPr>
@@ -241,7 +289,7 @@
           <w:p>
             <w:pPr>
               <w:jc w:val="left"/>
-              <w:spacing w:before="0" w:after="160" w:line="240" w:lineRule="auto"/>
+              <w:spacing w:before="0" w:after="0" w:line="240" w:lineRule="auto"/>
             </w:pPr>
             <w:r>
               <w:rPr>
@@ -340,8 +388,8 @@
             <w:pPr>
               <w:bidi/>
               <w:jc w:val="right"/>
-              <w:ind w:right="360"/>
-              <w:spacing w:after="120"/>
+              <w:ind w:right="450"/>
+              <w:spacing w:after="600"/>
             </w:pPr>
             <w:r>
               <w:rPr>
@@ -397,7 +445,7 @@
           <w:p>
             <w:pPr>
               <w:jc w:val="left"/>
-              <w:spacing w:before="0" w:after="160" w:line="240" w:lineRule="auto"/>
+              <w:spacing w:before="0" w:after="0" w:line="240" w:lineRule="auto"/>
             </w:pPr>
             <w:r>
               <w:rPr>
@@ -505,8 +553,7 @@
             <w:pPr>
               <w:bidi/>
               <w:jc w:val="right"/>
-              <w:ind w:right="360"/>
-              <w:spacing w:after="120"/>
+              <w:ind w:right="450"/>
             </w:pPr>
             <w:r>
               <w:rPr>
@@ -562,7 +609,7 @@
           <w:p>
             <w:pPr>
               <w:jc w:val="left"/>
-              <w:spacing w:before="0" w:after="160" w:line="240" w:lineRule="auto"/>
+              <w:spacing w:before="0" w:after="0" w:line="240" w:lineRule="auto"/>
             </w:pPr>
             <w:r>
               <w:rPr>
@@ -652,8 +699,7 @@
             <w:pPr>
               <w:bidi/>
               <w:jc w:val="right"/>
-              <w:ind w:right="360"/>
-              <w:spacing w:after="120"/>
+              <w:ind w:right="450"/>
             </w:pPr>
             <w:r>
               <w:rPr>
@@ -681,6 +727,219 @@
                 <w:szCs w:val="32"/>
               </w:rPr>
               <w:t xml:space="preserve">יֵחָצְבוּן </w:t>
+            </w:r>
+          </w:p>
+        </w:tc>
+      </w:tr>
+    </w:tbl>
+    <w:p>
+      <w:r>
+        <w:br w:type="page"/>
+      </w:r>
+    </w:p>
+    <w:tbl>
+      <w:tblPr>
+        <w:tblW w:w="5000" w:type="pct"/>
+        <w:tblLayout w:type="fixed"/>
+        <w:jc w:val="right"/>
+        <w:tblInd w:w="0" w:type="dxa"/>
+        <w:tblBorders>
+          <w:top w:val="nil"/>
+          <w:left w:val="nil"/>
+          <w:bottom w:val="nil"/>
+          <w:right w:val="nil"/>
+          <w:insideH w:val="nil"/>
+          <w:insideV w:val="nil"/>
+        </w:tblBorders>
+        <w:tblCellMar>
+          <w:top w:w="20" w:type="dxa"/>
+          <w:left w:w="40" w:type="dxa"/>
+          <w:bottom w:w="20" w:type="dxa"/>
+          <w:right w:w="0" w:type="dxa"/>
+        </w:tblCellMar>
+      </w:tblPr>
+      <w:tblGrid>
+        <w:gridCol w:w="6200"/>
+        <w:gridCol w:w="500"/>
+        <w:gridCol w:w="4100"/>
+      </w:tblGrid>
+      <w:tr>
+        <w:trPr>
+          <w:cantSplit/>
+        </w:trPr>
+        <w:tc>
+          <w:tcPr>
+            <w:tcW w:w="6200" w:type="dxa"/>
+            <w:tcBorders>
+              <w:top w:val="nil"/>
+              <w:left w:val="nil"/>
+              <w:bottom w:val="nil"/>
+              <w:right w:val="nil"/>
+            </w:tcBorders>
+            <w:tcMar>
+              <w:top w:w="20" w:type="dxa"/>
+              <w:left w:w="0" w:type="dxa"/>
+              <w:bottom w:w="20" w:type="dxa"/>
+              <w:right w:w="40" w:type="dxa"/>
+            </w:tcMar>
+            <w:vAlign w:val="top"/>
+          </w:tcPr>
+          <w:p>
+            <w:pPr>
+              <w:jc w:val="left"/>
+              <w:spacing w:before="0" w:after="0" w:line="240" w:lineRule="auto"/>
+            </w:pPr>
+            <w:r>
+              <w:rPr>
+                <w:rFonts w:ascii="Times New Roman" w:hAnsi="Times New Roman" w:cs="Times New Roman"/>
+                <w:sz w:val="23"/>
+                <w:szCs w:val="23"/>
+              </w:rPr>
+              <w:t xml:space="preserve">For I know that my Redeemer lives,</w:t>
+            </w:r>
+            <w:r>
+              <w:rPr>
+                <w:rFonts w:ascii="Times New Roman" w:hAnsi="Times New Roman" w:cs="Times New Roman"/>
+                <w:sz w:val="23"/>
+                <w:szCs w:val="23"/>
+              </w:rPr>
+              <w:br/>
+            </w:r>
+            <w:r>
+              <w:rPr>
+                <w:rFonts w:ascii="Times New Roman" w:hAnsi="Times New Roman" w:cs="Times New Roman"/>
+                <w:sz w:val="23"/>
+                <w:szCs w:val="23"/>
+              </w:rPr>
+              <w:t xml:space="preserve">and that at the last he will stand upon the earth;</w:t>
+            </w:r>
+          </w:p>
+        </w:tc>
+        <w:tc>
+          <w:tcPr>
+            <w:tcW w:w="500" w:type="dxa"/>
+            <w:tcBorders>
+              <w:top w:val="nil"/>
+              <w:left w:val="nil"/>
+              <w:bottom w:val="nil"/>
+              <w:right w:val="nil"/>
+            </w:tcBorders>
+            <w:tcMar>
+              <w:top w:w="20" w:type="dxa"/>
+              <w:left w:w="20" w:type="dxa"/>
+              <w:bottom w:w="20" w:type="dxa"/>
+              <w:right w:w="20" w:type="dxa"/>
+            </w:tcMar>
+            <w:vAlign w:val="top"/>
+          </w:tcPr>
+          <w:p>
+            <w:pPr>
+              <w:jc w:val="center"/>
+              <w:spacing w:before="0" w:after="0"/>
+            </w:pPr>
+            <w:r>
+              <w:rPr>
+                <w:rFonts w:ascii="Times New Roman" w:hAnsi="Times New Roman" w:cs="Times New Roman"/>
+                <w:sz w:val="18"/>
+                <w:szCs w:val="18"/>
+              </w:rPr>
+              <w:t>25</w:t>
+            </w:r>
+          </w:p>
+        </w:tc>
+        <w:tc>
+          <w:tcPr>
+            <w:tcW w:w="4100" w:type="dxa"/>
+            <w:tcBorders>
+              <w:top w:val="nil"/>
+              <w:left w:val="nil"/>
+              <w:bottom w:val="nil"/>
+              <w:right w:val="nil"/>
+            </w:tcBorders>
+            <w:tcMar>
+              <w:top w:w="20" w:type="dxa"/>
+              <w:left w:w="40" w:type="dxa"/>
+              <w:bottom w:w="20" w:type="dxa"/>
+              <w:right w:w="0" w:type="dxa"/>
+            </w:tcMar>
+            <w:vAlign w:val="top"/>
+          </w:tcPr>
+          <w:p>
+            <w:pPr>
+              <w:bidi/>
+              <w:jc w:val="right"/>
+              <w:ind w:right="0"/>
+            </w:pPr>
+            <w:r>
+              <w:rPr>
+                <w:rFonts w:ascii="SBL BibLit" w:hAnsi="SBL BibLit" w:cs="SBL BibLit"/>
+                <w:rtl/>
+                <w:sz w:val="32"/>
+                <w:szCs w:val="32"/>
+              </w:rPr>
+              <w:t xml:space="preserve">וַאֲנִי </w:t>
+            </w:r>
+            <w:r>
+              <w:rPr>
+                <w:rFonts w:ascii="SBL BibLit" w:hAnsi="SBL BibLit" w:cs="SBL BibLit"/>
+                <w:rtl/>
+                <w:sz w:val="32"/>
+                <w:szCs w:val="32"/>
+              </w:rPr>
+              <w:t xml:space="preserve">יָדַעְתִּי </w:t>
+            </w:r>
+            <w:r>
+              <w:rPr>
+                <w:rFonts w:ascii="SBL BibLit" w:hAnsi="SBL BibLit" w:cs="SBL BibLit"/>
+                <w:rtl/>
+                <w:sz w:val="32"/>
+                <w:szCs w:val="32"/>
+              </w:rPr>
+              <w:t xml:space="preserve">גֹּאֲלִי </w:t>
+            </w:r>
+            <w:r>
+              <w:rPr>
+                <w:rFonts w:ascii="SBL BibLit" w:hAnsi="SBL BibLit" w:cs="SBL BibLit"/>
+                <w:rtl/>
+                <w:sz w:val="32"/>
+                <w:szCs w:val="32"/>
+              </w:rPr>
+              <w:t xml:space="preserve">חָי </w:t>
+            </w:r>
+          </w:p>
+          <w:p>
+            <w:pPr>
+              <w:bidi/>
+              <w:jc w:val="right"/>
+              <w:ind w:right="450"/>
+              <w:spacing w:after="2718"/>
+            </w:pPr>
+            <w:r>
+              <w:rPr>
+                <w:rFonts w:ascii="SBL BibLit" w:hAnsi="SBL BibLit" w:cs="SBL BibLit"/>
+                <w:rtl/>
+                <w:sz w:val="32"/>
+                <w:szCs w:val="32"/>
+              </w:rPr>
+              <w:t xml:space="preserve">וְאַחֲרוֹן </w:t>
+            </w:r>
+            <w:r>
+              <w:rPr>
+                <w:rFonts w:ascii="SBL BibLit" w:hAnsi="SBL BibLit" w:cs="SBL BibLit"/>
+                <w:rtl/>
+                <w:sz w:val="32"/>
+                <w:szCs w:val="32"/>
+              </w:rPr>
+              <w:t xml:space="preserve">עַל־עָפָר </w:t>
+            </w:r>
+            <w:r>
+              <w:rPr>
+                <w:rFonts w:ascii="SBL BibLit" w:hAnsi="SBL BibLit" w:cs="SBL BibLit"/>
+                <w:rtl/>
+                <w:sz w:val="32"/>
+                <w:szCs w:val="32"/>
+              </w:rPr>
+              <w:t xml:space="preserve">יָקוּם </w:t>
             </w:r>
           </w:p>
         </w:tc>
@@ -709,7 +968,7 @@
           <w:p>
             <w:pPr>
               <w:jc w:val="left"/>
-              <w:spacing w:before="0" w:after="160" w:line="240" w:lineRule="auto"/>
+              <w:spacing w:before="0" w:after="0" w:line="240" w:lineRule="auto"/>
             </w:pPr>
             <w:r>
               <w:rPr>
@@ -717,7 +976,7 @@
                 <w:sz w:val="23"/>
                 <w:szCs w:val="23"/>
               </w:rPr>
-              <w:t xml:space="preserve">For I know that my Redeemer lives, and that at the last he will stand upon the earth;</w:t>
+              <w:t xml:space="preserve">and after my skin has been thus destroyed, then in my flesh I shall see God,</w:t>
             </w:r>
           </w:p>
         </w:tc>
@@ -749,7 +1008,7 @@
                 <w:sz w:val="18"/>
                 <w:szCs w:val="18"/>
               </w:rPr>
-              <w:t>25</w:t>
+              <w:t>26</w:t>
             </w:r>
           </w:p>
         </w:tc>
@@ -783,69 +1042,59 @@
                 <w:sz w:val="32"/>
                 <w:szCs w:val="32"/>
               </w:rPr>
-              <w:t xml:space="preserve">וַאֲנִי </w:t>
-            </w:r>
-            <w:r>
-              <w:rPr>
-                <w:rFonts w:ascii="SBL BibLit" w:hAnsi="SBL BibLit" w:cs="SBL BibLit"/>
-                <w:rtl/>
-                <w:sz w:val="32"/>
-                <w:szCs w:val="32"/>
-              </w:rPr>
-              <w:t xml:space="preserve">יָדַעְתִּי </w:t>
-            </w:r>
-            <w:r>
-              <w:rPr>
-                <w:rFonts w:ascii="SBL BibLit" w:hAnsi="SBL BibLit" w:cs="SBL BibLit"/>
-                <w:rtl/>
-                <w:sz w:val="32"/>
-                <w:szCs w:val="32"/>
-              </w:rPr>
-              <w:t xml:space="preserve">גֹּאֲלִי </w:t>
-            </w:r>
-            <w:r>
-              <w:rPr>
-                <w:rFonts w:ascii="SBL BibLit" w:hAnsi="SBL BibLit" w:cs="SBL BibLit"/>
-                <w:rtl/>
-                <w:sz w:val="32"/>
-                <w:szCs w:val="32"/>
-              </w:rPr>
-              <w:t xml:space="preserve">חָי </w:t>
-            </w:r>
-          </w:p>
-          <w:p>
-            <w:pPr>
-              <w:bidi/>
-              <w:jc w:val="right"/>
-              <w:ind w:right="360"/>
-              <w:spacing w:after="120"/>
-            </w:pPr>
-            <w:r>
-              <w:rPr>
-                <w:rFonts w:ascii="SBL BibLit" w:hAnsi="SBL BibLit" w:cs="SBL BibLit"/>
-                <w:rtl/>
-                <w:sz w:val="32"/>
-                <w:szCs w:val="32"/>
-              </w:rPr>
-              <w:t xml:space="preserve">וְאַחֲרוֹן </w:t>
-            </w:r>
-            <w:r>
-              <w:rPr>
-                <w:rFonts w:ascii="SBL BibLit" w:hAnsi="SBL BibLit" w:cs="SBL BibLit"/>
-                <w:rtl/>
-                <w:sz w:val="32"/>
-                <w:szCs w:val="32"/>
-              </w:rPr>
-              <w:t xml:space="preserve">עַל־עָפָר </w:t>
-            </w:r>
-            <w:r>
-              <w:rPr>
-                <w:rFonts w:ascii="SBL BibLit" w:hAnsi="SBL BibLit" w:cs="SBL BibLit"/>
-                <w:rtl/>
-                <w:sz w:val="32"/>
-                <w:szCs w:val="32"/>
-              </w:rPr>
-              <w:t xml:space="preserve">יָקוּם </w:t>
+              <w:t xml:space="preserve">וְאַחַר </w:t>
+            </w:r>
+            <w:r>
+              <w:rPr>
+                <w:rFonts w:ascii="SBL BibLit" w:hAnsi="SBL BibLit" w:cs="SBL BibLit"/>
+                <w:rtl/>
+                <w:sz w:val="32"/>
+                <w:szCs w:val="32"/>
+              </w:rPr>
+              <w:t xml:space="preserve">עוֹרִי </w:t>
+            </w:r>
+            <w:r>
+              <w:rPr>
+                <w:rFonts w:ascii="SBL BibLit" w:hAnsi="SBL BibLit" w:cs="SBL BibLit"/>
+                <w:rtl/>
+                <w:sz w:val="32"/>
+                <w:szCs w:val="32"/>
+              </w:rPr>
+              <w:t xml:space="preserve">נִקְּפוּ־זֹאת </w:t>
+            </w:r>
+          </w:p>
+          <w:p>
+            <w:pPr>
+              <w:bidi/>
+              <w:jc w:val="right"/>
+              <w:ind w:right="450"/>
+            </w:pPr>
+            <w:r>
+              <w:rPr>
+                <w:rFonts w:ascii="SBL BibLit" w:hAnsi="SBL BibLit" w:cs="SBL BibLit"/>
+                <w:rtl/>
+                <w:sz w:val="32"/>
+                <w:szCs w:val="32"/>
+              </w:rPr>
+              <w:t xml:space="preserve">וּמִבְּשָׂרִי </w:t>
+            </w:r>
+            <w:r>
+              <w:rPr>
+                <w:rFonts w:ascii="SBL BibLit" w:hAnsi="SBL BibLit" w:cs="SBL BibLit"/>
+                <w:rtl/>
+                <w:sz w:val="32"/>
+                <w:szCs w:val="32"/>
+              </w:rPr>
+              <w:t xml:space="preserve">אֶחֱזֶה </w:t>
+            </w:r>
+            <w:r>
+              <w:rPr>
+                <w:rFonts w:ascii="SBL BibLit" w:hAnsi="SBL BibLit" w:cs="SBL BibLit"/>
+                <w:rtl/>
+                <w:sz w:val="32"/>
+                <w:szCs w:val="32"/>
+              </w:rPr>
+              <w:t xml:space="preserve">אֱלוֹהַּ </w:t>
             </w:r>
           </w:p>
         </w:tc>
@@ -874,7 +1123,7 @@
           <w:p>
             <w:pPr>
               <w:jc w:val="left"/>
-              <w:spacing w:before="0" w:after="160" w:line="240" w:lineRule="auto"/>
+              <w:spacing w:before="0" w:after="0" w:line="240" w:lineRule="auto"/>
             </w:pPr>
             <w:r>
               <w:rPr>
@@ -882,7 +1131,7 @@
                 <w:sz w:val="23"/>
                 <w:szCs w:val="23"/>
               </w:rPr>
-              <w:t xml:space="preserve">and after my skin has been thus destroyed, then in my flesh I shall see God,</w:t>
+              <w:t xml:space="preserve">whom I shall see on my side, and my eyes shall behold, and not another. My heart faints within me!</w:t>
             </w:r>
           </w:p>
         </w:tc>
@@ -914,7 +1163,7 @@
                 <w:sz w:val="18"/>
                 <w:szCs w:val="18"/>
               </w:rPr>
-              <w:t>26</w:t>
+              <w:t>27</w:t>
             </w:r>
           </w:p>
         </w:tc>
@@ -948,60 +1197,93 @@
                 <w:sz w:val="32"/>
                 <w:szCs w:val="32"/>
               </w:rPr>
-              <w:t xml:space="preserve">וְאַחַר </w:t>
-            </w:r>
-            <w:r>
-              <w:rPr>
-                <w:rFonts w:ascii="SBL BibLit" w:hAnsi="SBL BibLit" w:cs="SBL BibLit"/>
-                <w:rtl/>
-                <w:sz w:val="32"/>
-                <w:szCs w:val="32"/>
-              </w:rPr>
-              <w:t xml:space="preserve">עוֹרִי </w:t>
-            </w:r>
-            <w:r>
-              <w:rPr>
-                <w:rFonts w:ascii="SBL BibLit" w:hAnsi="SBL BibLit" w:cs="SBL BibLit"/>
-                <w:rtl/>
-                <w:sz w:val="32"/>
-                <w:szCs w:val="32"/>
-              </w:rPr>
-              <w:t xml:space="preserve">נִקְּפוּ־זֹאת </w:t>
-            </w:r>
-          </w:p>
-          <w:p>
-            <w:pPr>
-              <w:bidi/>
-              <w:jc w:val="right"/>
-              <w:ind w:right="360"/>
-              <w:spacing w:after="120"/>
-            </w:pPr>
-            <w:r>
-              <w:rPr>
-                <w:rFonts w:ascii="SBL BibLit" w:hAnsi="SBL BibLit" w:cs="SBL BibLit"/>
-                <w:rtl/>
-                <w:sz w:val="32"/>
-                <w:szCs w:val="32"/>
-              </w:rPr>
-              <w:t xml:space="preserve">וּמִבְּשָׂרִי </w:t>
-            </w:r>
-            <w:r>
-              <w:rPr>
-                <w:rFonts w:ascii="SBL BibLit" w:hAnsi="SBL BibLit" w:cs="SBL BibLit"/>
-                <w:rtl/>
-                <w:sz w:val="32"/>
-                <w:szCs w:val="32"/>
-              </w:rPr>
-              <w:t xml:space="preserve">אֶחֱזֶה </w:t>
-            </w:r>
-            <w:r>
-              <w:rPr>
-                <w:rFonts w:ascii="SBL BibLit" w:hAnsi="SBL BibLit" w:cs="SBL BibLit"/>
-                <w:rtl/>
-                <w:sz w:val="32"/>
-                <w:szCs w:val="32"/>
-              </w:rPr>
-              <w:t xml:space="preserve">אֱלוֹהַּ </w:t>
+              <w:t xml:space="preserve">אֲשֶׁר </w:t>
+            </w:r>
+            <w:r>
+              <w:rPr>
+                <w:rFonts w:ascii="SBL BibLit" w:hAnsi="SBL BibLit" w:cs="SBL BibLit"/>
+                <w:rtl/>
+                <w:sz w:val="32"/>
+                <w:szCs w:val="32"/>
+              </w:rPr>
+              <w:t xml:space="preserve">אֲנִי </w:t>
+            </w:r>
+            <w:r>
+              <w:rPr>
+                <w:rFonts w:ascii="SBL BibLit" w:hAnsi="SBL BibLit" w:cs="SBL BibLit"/>
+                <w:rtl/>
+                <w:sz w:val="32"/>
+                <w:szCs w:val="32"/>
+              </w:rPr>
+              <w:t xml:space="preserve">אֶחֱזֶה־לִּי </w:t>
+            </w:r>
+          </w:p>
+          <w:p>
+            <w:pPr>
+              <w:bidi/>
+              <w:jc w:val="right"/>
+              <w:ind w:right="450"/>
+            </w:pPr>
+            <w:r>
+              <w:rPr>
+                <w:rFonts w:ascii="SBL BibLit" w:hAnsi="SBL BibLit" w:cs="SBL BibLit"/>
+                <w:rtl/>
+                <w:sz w:val="32"/>
+                <w:szCs w:val="32"/>
+              </w:rPr>
+              <w:t xml:space="preserve">וְעֵינַי </w:t>
+            </w:r>
+            <w:r>
+              <w:rPr>
+                <w:rFonts w:ascii="SBL BibLit" w:hAnsi="SBL BibLit" w:cs="SBL BibLit"/>
+                <w:rtl/>
+                <w:sz w:val="32"/>
+                <w:szCs w:val="32"/>
+              </w:rPr>
+              <w:t xml:space="preserve">רָאוּ </w:t>
+            </w:r>
+            <w:r>
+              <w:rPr>
+                <w:rFonts w:ascii="SBL BibLit" w:hAnsi="SBL BibLit" w:cs="SBL BibLit"/>
+                <w:rtl/>
+                <w:sz w:val="32"/>
+                <w:szCs w:val="32"/>
+              </w:rPr>
+              <w:t xml:space="preserve">וְלֹא־זָר </w:t>
+            </w:r>
+          </w:p>
+          <w:p>
+            <w:pPr>
+              <w:bidi/>
+              <w:jc w:val="right"/>
+              <w:ind w:right="0"/>
+            </w:pPr>
+            <w:r>
+              <w:rPr>
+                <w:rFonts w:ascii="SBL BibLit" w:hAnsi="SBL BibLit" w:cs="SBL BibLit"/>
+                <w:rtl/>
+                <w:sz w:val="32"/>
+                <w:szCs w:val="32"/>
+              </w:rPr>
+              <w:t xml:space="preserve">כָּלוּ </w:t>
+            </w:r>
+            <w:r>
+              <w:rPr>
+                <w:rFonts w:ascii="SBL BibLit" w:hAnsi="SBL BibLit" w:cs="SBL BibLit"/>
+                <w:rtl/>
+                <w:sz w:val="32"/>
+                <w:szCs w:val="32"/>
+              </w:rPr>
+              <w:t xml:space="preserve">כִלְיֹתַי </w:t>
+            </w:r>
+            <w:r>
+              <w:rPr>
+                <w:rFonts w:ascii="SBL BibLit" w:hAnsi="SBL BibLit" w:cs="SBL BibLit"/>
+                <w:rtl/>
+                <w:sz w:val="32"/>
+                <w:szCs w:val="32"/>
+              </w:rPr>
+              <w:t xml:space="preserve">בְּחֵקִי </w:t>
             </w:r>
           </w:p>
         </w:tc>
@@ -1030,7 +1312,7 @@
           <w:p>
             <w:pPr>
               <w:jc w:val="left"/>
-              <w:spacing w:before="0" w:after="160" w:line="240" w:lineRule="auto"/>
+              <w:spacing w:before="0" w:after="0" w:line="240" w:lineRule="auto"/>
             </w:pPr>
             <w:r>
               <w:rPr>
@@ -1038,7 +1320,7 @@
                 <w:sz w:val="23"/>
                 <w:szCs w:val="23"/>
               </w:rPr>
-              <w:t xml:space="preserve">whom I shall see on my side, and my eyes shall behold, and not another. My heart faints within me!</w:t>
+              <w:t xml:space="preserve">If you say, ‘How we will pursue him!’ and, ‘The root of the matter is found in him,’</w:t>
             </w:r>
           </w:p>
         </w:tc>
@@ -1070,7 +1352,7 @@
                 <w:sz w:val="18"/>
                 <w:szCs w:val="18"/>
               </w:rPr>
-              <w:t>27</w:t>
+              <w:t>28</w:t>
             </w:r>
           </w:p>
         </w:tc>
@@ -1104,94 +1386,59 @@
                 <w:sz w:val="32"/>
                 <w:szCs w:val="32"/>
               </w:rPr>
-              <w:t xml:space="preserve">אֲשֶׁר </w:t>
-            </w:r>
-            <w:r>
-              <w:rPr>
-                <w:rFonts w:ascii="SBL BibLit" w:hAnsi="SBL BibLit" w:cs="SBL BibLit"/>
-                <w:rtl/>
-                <w:sz w:val="32"/>
-                <w:szCs w:val="32"/>
-              </w:rPr>
-              <w:t xml:space="preserve">אֲנִי </w:t>
-            </w:r>
-            <w:r>
-              <w:rPr>
-                <w:rFonts w:ascii="SBL BibLit" w:hAnsi="SBL BibLit" w:cs="SBL BibLit"/>
-                <w:rtl/>
-                <w:sz w:val="32"/>
-                <w:szCs w:val="32"/>
-              </w:rPr>
-              <w:t xml:space="preserve">אֶחֱזֶה־לִּי </w:t>
-            </w:r>
-          </w:p>
-          <w:p>
-            <w:pPr>
-              <w:bidi/>
-              <w:jc w:val="right"/>
-              <w:ind w:right="360"/>
-            </w:pPr>
-            <w:r>
-              <w:rPr>
-                <w:rFonts w:ascii="SBL BibLit" w:hAnsi="SBL BibLit" w:cs="SBL BibLit"/>
-                <w:rtl/>
-                <w:sz w:val="32"/>
-                <w:szCs w:val="32"/>
-              </w:rPr>
-              <w:t xml:space="preserve">וְעֵינַי </w:t>
-            </w:r>
-            <w:r>
-              <w:rPr>
-                <w:rFonts w:ascii="SBL BibLit" w:hAnsi="SBL BibLit" w:cs="SBL BibLit"/>
-                <w:rtl/>
-                <w:sz w:val="32"/>
-                <w:szCs w:val="32"/>
-              </w:rPr>
-              <w:t xml:space="preserve">רָאוּ </w:t>
-            </w:r>
-            <w:r>
-              <w:rPr>
-                <w:rFonts w:ascii="SBL BibLit" w:hAnsi="SBL BibLit" w:cs="SBL BibLit"/>
-                <w:rtl/>
-                <w:sz w:val="32"/>
-                <w:szCs w:val="32"/>
-              </w:rPr>
-              <w:t xml:space="preserve">וְלֹא־זָר </w:t>
-            </w:r>
-          </w:p>
-          <w:p>
-            <w:pPr>
-              <w:bidi/>
-              <w:jc w:val="right"/>
-              <w:ind w:right="0"/>
-              <w:spacing w:after="120"/>
-            </w:pPr>
-            <w:r>
-              <w:rPr>
-                <w:rFonts w:ascii="SBL BibLit" w:hAnsi="SBL BibLit" w:cs="SBL BibLit"/>
-                <w:rtl/>
-                <w:sz w:val="32"/>
-                <w:szCs w:val="32"/>
-              </w:rPr>
-              <w:t xml:space="preserve">כָּלוּ </w:t>
-            </w:r>
-            <w:r>
-              <w:rPr>
-                <w:rFonts w:ascii="SBL BibLit" w:hAnsi="SBL BibLit" w:cs="SBL BibLit"/>
-                <w:rtl/>
-                <w:sz w:val="32"/>
-                <w:szCs w:val="32"/>
-              </w:rPr>
-              <w:t xml:space="preserve">כִלְיֹתַי </w:t>
-            </w:r>
-            <w:r>
-              <w:rPr>
-                <w:rFonts w:ascii="SBL BibLit" w:hAnsi="SBL BibLit" w:cs="SBL BibLit"/>
-                <w:rtl/>
-                <w:sz w:val="32"/>
-                <w:szCs w:val="32"/>
-              </w:rPr>
-              <w:t xml:space="preserve">בְּחֵקִי </w:t>
+              <w:t xml:space="preserve">כִּי </w:t>
+            </w:r>
+            <w:r>
+              <w:rPr>
+                <w:rFonts w:ascii="SBL BibLit" w:hAnsi="SBL BibLit" w:cs="SBL BibLit"/>
+                <w:rtl/>
+                <w:sz w:val="32"/>
+                <w:szCs w:val="32"/>
+              </w:rPr>
+              <w:t xml:space="preserve">תֹאמְרוּ </w:t>
+            </w:r>
+            <w:r>
+              <w:rPr>
+                <w:rFonts w:ascii="SBL BibLit" w:hAnsi="SBL BibLit" w:cs="SBL BibLit"/>
+                <w:rtl/>
+                <w:sz w:val="32"/>
+                <w:szCs w:val="32"/>
+              </w:rPr>
+              <w:t xml:space="preserve">מַה־נִּרְדָּף־לוֹ </w:t>
+            </w:r>
+          </w:p>
+          <w:p>
+            <w:pPr>
+              <w:bidi/>
+              <w:jc w:val="right"/>
+              <w:ind w:right="450"/>
+            </w:pPr>
+            <w:r>
+              <w:rPr>
+                <w:rFonts w:ascii="SBL BibLit" w:hAnsi="SBL BibLit" w:cs="SBL BibLit"/>
+                <w:rtl/>
+                <w:sz w:val="32"/>
+                <w:szCs w:val="32"/>
+              </w:rPr>
+              <w:t xml:space="preserve">וְשֹׁרֶשׁ </w:t>
+            </w:r>
+            <w:r>
+              <w:rPr>
+                <w:rFonts w:ascii="SBL BibLit" w:hAnsi="SBL BibLit" w:cs="SBL BibLit"/>
+                <w:rtl/>
+                <w:sz w:val="32"/>
+                <w:szCs w:val="32"/>
+              </w:rPr>
+              <w:t xml:space="preserve">דָּבָר </w:t>
+            </w:r>
+            <w:r>
+              <w:rPr>
+                <w:rFonts w:ascii="SBL BibLit" w:hAnsi="SBL BibLit" w:cs="SBL BibLit"/>
+                <w:rtl/>
+                <w:sz w:val="32"/>
+                <w:szCs w:val="32"/>
+              </w:rPr>
+              <w:t xml:space="preserve">נִמְצָא־בִי </w:t>
             </w:r>
           </w:p>
         </w:tc>
@@ -1220,7 +1467,7 @@
           <w:p>
             <w:pPr>
               <w:jc w:val="left"/>
-              <w:spacing w:before="0" w:after="160" w:line="240" w:lineRule="auto"/>
+              <w:spacing w:before="0" w:after="0" w:line="240" w:lineRule="auto"/>
             </w:pPr>
             <w:r>
               <w:rPr>
@@ -1228,7 +1475,7 @@
                 <w:sz w:val="23"/>
                 <w:szCs w:val="23"/>
               </w:rPr>
-              <w:t xml:space="preserve">If you say, ‘How we will pursue him!’ and, ‘The root of the matter is found in him,’</w:t>
+              <w:t xml:space="preserve">be afraid of the sword, for wrath brings the punishment of the sword, so that you may know there is a judgment.</w:t>
             </w:r>
           </w:p>
         </w:tc>
@@ -1260,7 +1507,7 @@
                 <w:sz w:val="18"/>
                 <w:szCs w:val="18"/>
               </w:rPr>
-              <w:t>28</w:t>
+              <w:t>29</w:t>
             </w:r>
           </w:p>
         </w:tc>
@@ -1294,223 +1541,66 @@
                 <w:sz w:val="32"/>
                 <w:szCs w:val="32"/>
               </w:rPr>
-              <w:t xml:space="preserve">כִּי </w:t>
-            </w:r>
-            <w:r>
-              <w:rPr>
-                <w:rFonts w:ascii="SBL BibLit" w:hAnsi="SBL BibLit" w:cs="SBL BibLit"/>
-                <w:rtl/>
-                <w:sz w:val="32"/>
-                <w:szCs w:val="32"/>
-              </w:rPr>
-              <w:t xml:space="preserve">תֹאמְרוּ </w:t>
-            </w:r>
-            <w:r>
-              <w:rPr>
-                <w:rFonts w:ascii="SBL BibLit" w:hAnsi="SBL BibLit" w:cs="SBL BibLit"/>
-                <w:rtl/>
-                <w:sz w:val="32"/>
-                <w:szCs w:val="32"/>
-              </w:rPr>
-              <w:t xml:space="preserve">מַה־נִּרְדָּף־לוֹ </w:t>
-            </w:r>
-          </w:p>
-          <w:p>
-            <w:pPr>
-              <w:bidi/>
-              <w:jc w:val="right"/>
-              <w:ind w:right="360"/>
-              <w:spacing w:after="120"/>
-            </w:pPr>
-            <w:r>
-              <w:rPr>
-                <w:rFonts w:ascii="SBL BibLit" w:hAnsi="SBL BibLit" w:cs="SBL BibLit"/>
-                <w:rtl/>
-                <w:sz w:val="32"/>
-                <w:szCs w:val="32"/>
-              </w:rPr>
-              <w:t xml:space="preserve">וְשֹׁרֶשׁ </w:t>
-            </w:r>
-            <w:r>
-              <w:rPr>
-                <w:rFonts w:ascii="SBL BibLit" w:hAnsi="SBL BibLit" w:cs="SBL BibLit"/>
-                <w:rtl/>
-                <w:sz w:val="32"/>
-                <w:szCs w:val="32"/>
-              </w:rPr>
-              <w:t xml:space="preserve">דָּבָר </w:t>
-            </w:r>
-            <w:r>
-              <w:rPr>
-                <w:rFonts w:ascii="SBL BibLit" w:hAnsi="SBL BibLit" w:cs="SBL BibLit"/>
-                <w:rtl/>
-                <w:sz w:val="32"/>
-                <w:szCs w:val="32"/>
-              </w:rPr>
-              <w:t xml:space="preserve">נִמְצָא־בִי </w:t>
-            </w:r>
-          </w:p>
-        </w:tc>
-      </w:tr>
-      <w:tr>
-        <w:trPr>
-          <w:cantSplit/>
-        </w:trPr>
-        <w:tc>
-          <w:tcPr>
-            <w:tcW w:w="6200" w:type="dxa"/>
-            <w:tcBorders>
-              <w:top w:val="nil"/>
-              <w:left w:val="nil"/>
-              <w:bottom w:val="nil"/>
-              <w:right w:val="nil"/>
-            </w:tcBorders>
-            <w:tcMar>
-              <w:top w:w="20" w:type="dxa"/>
-              <w:left w:w="0" w:type="dxa"/>
-              <w:bottom w:w="20" w:type="dxa"/>
-              <w:right w:w="40" w:type="dxa"/>
-            </w:tcMar>
-            <w:vAlign w:val="top"/>
-          </w:tcPr>
-          <w:p>
-            <w:pPr>
-              <w:jc w:val="left"/>
-              <w:spacing w:before="0" w:after="160" w:line="240" w:lineRule="auto"/>
-            </w:pPr>
-            <w:r>
-              <w:rPr>
-                <w:rFonts w:ascii="Times New Roman" w:hAnsi="Times New Roman" w:cs="Times New Roman"/>
-                <w:sz w:val="23"/>
-                <w:szCs w:val="23"/>
-              </w:rPr>
-              <w:t xml:space="preserve">be afraid of the sword, for wrath brings the punishment of the sword, so that you may know there is a judgment.</w:t>
-            </w:r>
-          </w:p>
-        </w:tc>
-        <w:tc>
-          <w:tcPr>
-            <w:tcW w:w="500" w:type="dxa"/>
-            <w:tcBorders>
-              <w:top w:val="nil"/>
-              <w:left w:val="nil"/>
-              <w:bottom w:val="nil"/>
-              <w:right w:val="nil"/>
-            </w:tcBorders>
-            <w:tcMar>
-              <w:top w:w="20" w:type="dxa"/>
-              <w:left w:w="20" w:type="dxa"/>
-              <w:bottom w:w="20" w:type="dxa"/>
-              <w:right w:w="20" w:type="dxa"/>
-            </w:tcMar>
-            <w:vAlign w:val="top"/>
-          </w:tcPr>
-          <w:p>
-            <w:pPr>
-              <w:jc w:val="center"/>
-              <w:spacing w:before="0" w:after="0"/>
-            </w:pPr>
-            <w:r>
-              <w:rPr>
-                <w:rFonts w:ascii="Times New Roman" w:hAnsi="Times New Roman" w:cs="Times New Roman"/>
-                <w:sz w:val="18"/>
-                <w:szCs w:val="18"/>
-              </w:rPr>
-              <w:t>29</w:t>
-            </w:r>
-          </w:p>
-        </w:tc>
-        <w:tc>
-          <w:tcPr>
-            <w:tcW w:w="4100" w:type="dxa"/>
-            <w:tcBorders>
-              <w:top w:val="nil"/>
-              <w:left w:val="nil"/>
-              <w:bottom w:val="nil"/>
-              <w:right w:val="nil"/>
-            </w:tcBorders>
-            <w:tcMar>
-              <w:top w:w="20" w:type="dxa"/>
-              <w:left w:w="40" w:type="dxa"/>
-              <w:bottom w:w="20" w:type="dxa"/>
-              <w:right w:w="0" w:type="dxa"/>
-            </w:tcMar>
-            <w:vAlign w:val="top"/>
-          </w:tcPr>
+              <w:t xml:space="preserve">גּוּרוּ </w:t>
+            </w:r>
+            <w:r>
+              <w:rPr>
+                <w:rFonts w:ascii="SBL BibLit" w:hAnsi="SBL BibLit" w:cs="SBL BibLit"/>
+                <w:rtl/>
+                <w:sz w:val="32"/>
+                <w:szCs w:val="32"/>
+              </w:rPr>
+              <w:t xml:space="preserve">לָכֶם </w:t>
+            </w:r>
+            <w:r>
+              <w:rPr>
+                <w:rFonts w:ascii="SBL BibLit" w:hAnsi="SBL BibLit" w:cs="SBL BibLit"/>
+                <w:rtl/>
+                <w:sz w:val="32"/>
+                <w:szCs w:val="32"/>
+              </w:rPr>
+              <w:t xml:space="preserve">מִפְּנֵי־חֶרֶב </w:t>
+            </w:r>
+          </w:p>
+          <w:p>
+            <w:pPr>
+              <w:bidi/>
+              <w:jc w:val="right"/>
+              <w:ind w:right="450"/>
+            </w:pPr>
+            <w:r>
+              <w:rPr>
+                <w:rFonts w:ascii="SBL BibLit" w:hAnsi="SBL BibLit" w:cs="SBL BibLit"/>
+                <w:rtl/>
+                <w:sz w:val="32"/>
+                <w:szCs w:val="32"/>
+              </w:rPr>
+              <w:t xml:space="preserve">כִּי־חֵמָה </w:t>
+            </w:r>
+            <w:r>
+              <w:rPr>
+                <w:rFonts w:ascii="SBL BibLit" w:hAnsi="SBL BibLit" w:cs="SBL BibLit"/>
+                <w:rtl/>
+                <w:sz w:val="32"/>
+                <w:szCs w:val="32"/>
+              </w:rPr>
+              <w:t xml:space="preserve">עֲוֺנוֹת </w:t>
+            </w:r>
+            <w:r>
+              <w:rPr>
+                <w:rFonts w:ascii="SBL BibLit" w:hAnsi="SBL BibLit" w:cs="SBL BibLit"/>
+                <w:rtl/>
+                <w:sz w:val="32"/>
+                <w:szCs w:val="32"/>
+              </w:rPr>
+              <w:t xml:space="preserve">חָרֶב </w:t>
+            </w:r>
+          </w:p>
           <w:p>
             <w:pPr>
               <w:bidi/>
               <w:jc w:val="right"/>
               <w:ind w:right="0"/>
-            </w:pPr>
-            <w:r>
-              <w:rPr>
-                <w:rFonts w:ascii="SBL BibLit" w:hAnsi="SBL BibLit" w:cs="SBL BibLit"/>
-                <w:rtl/>
-                <w:sz w:val="32"/>
-                <w:szCs w:val="32"/>
-              </w:rPr>
-              <w:t xml:space="preserve">גּוּרוּ </w:t>
-            </w:r>
-            <w:r>
-              <w:rPr>
-                <w:rFonts w:ascii="SBL BibLit" w:hAnsi="SBL BibLit" w:cs="SBL BibLit"/>
-                <w:rtl/>
-                <w:sz w:val="32"/>
-                <w:szCs w:val="32"/>
-              </w:rPr>
-              <w:t xml:space="preserve">לָכֶם </w:t>
-            </w:r>
-            <w:r>
-              <w:rPr>
-                <w:rFonts w:ascii="SBL BibLit" w:hAnsi="SBL BibLit" w:cs="SBL BibLit"/>
-                <w:rtl/>
-                <w:sz w:val="32"/>
-                <w:szCs w:val="32"/>
-              </w:rPr>
-              <w:t xml:space="preserve">מִפְּנֵי־חֶרֶב </w:t>
-            </w:r>
-          </w:p>
-          <w:p>
-            <w:pPr>
-              <w:bidi/>
-              <w:jc w:val="right"/>
-              <w:ind w:right="360"/>
-            </w:pPr>
-            <w:r>
-              <w:rPr>
-                <w:rFonts w:ascii="SBL BibLit" w:hAnsi="SBL BibLit" w:cs="SBL BibLit"/>
-                <w:rtl/>
-                <w:sz w:val="32"/>
-                <w:szCs w:val="32"/>
-              </w:rPr>
-              <w:t xml:space="preserve">כִּי־חֵמָה </w:t>
-            </w:r>
-            <w:r>
-              <w:rPr>
-                <w:rFonts w:ascii="SBL BibLit" w:hAnsi="SBL BibLit" w:cs="SBL BibLit"/>
-                <w:rtl/>
-                <w:sz w:val="32"/>
-                <w:szCs w:val="32"/>
-              </w:rPr>
-              <w:t xml:space="preserve">עֲוֺנוֹת </w:t>
-            </w:r>
-            <w:r>
-              <w:rPr>
-                <w:rFonts w:ascii="SBL BibLit" w:hAnsi="SBL BibLit" w:cs="SBL BibLit"/>
-                <w:rtl/>
-                <w:sz w:val="32"/>
-                <w:szCs w:val="32"/>
-              </w:rPr>
-              <w:t xml:space="preserve">חָרֶב </w:t>
-            </w:r>
-          </w:p>
-          <w:p>
-            <w:pPr>
-              <w:bidi/>
-              <w:jc w:val="right"/>
-              <w:ind w:right="0"/>
-              <w:spacing w:after="120"/>
             </w:pPr>
             <w:r>
               <w:rPr>

</xml_diff>